<commit_message>
Cite the current NCCN Lynch syndrome surveillance guideline
Resolves a DRAFT comment flagged since the Introduction was first drafted:
cite the current NCCN guideline version/year. Added reference 16 (NCCN
Genetic/Familial High-Risk Assessment: Colorectal, Endometrial, Esophageal,
and Gastric Cancer, Version 1.2026, June 16, 2026) and made the
surveillance sentence specific (biopsy every 1-2 years from age 30-35,
alongside colonoscopy) instead of the vaguer "regular intervals beginning
in the third or fourth decade of life."

Verified via a genetic-counseling organization's professional summary and
cross-checked against an independent January 2026 peer-reviewed review --
not a direct read of the primary NCCN PDF, which requires a free-account
login this session did not create. Flagged in-file for a primary-source
check before submission if institutional NCCN access is available.
</commit_message>
<xml_diff>
--- a/manuscript/manuscript.docx
+++ b/manuscript/manuscript.docx
@@ -378,19 +378,31 @@
         <w:t xml:space="preserve"> </w:t>
       </w:r>
       <w:r>
-        <w:t xml:space="preserve">diagnosis. Consensus guidelines recommend gynecologic surveillance with</w:t>
-      </w:r>
-      <w:r>
-        <w:t xml:space="preserve"> </w:t>
-      </w:r>
-      <w:r>
-        <w:t xml:space="preserve">endometrial biopsy at regular intervals beginning in the third or fourth</w:t>
-      </w:r>
-      <w:r>
-        <w:t xml:space="preserve"> </w:t>
-      </w:r>
-      <w:r>
-        <w:t xml:space="preserve">decade of life, alongside interval colonoscopy. Office endometrial biopsy</w:t>
+        <w:t xml:space="preserve">diagnosis. The National Comprehensive Cancer Network recommends</w:t>
+      </w:r>
+      <w:r>
+        <w:t xml:space="preserve"> </w:t>
+      </w:r>
+      <w:r>
+        <w:t xml:space="preserve">gynecologic surveillance with endometrial biopsy every 1-2 years beginning</w:t>
+      </w:r>
+      <w:r>
+        <w:t xml:space="preserve"> </w:t>
+      </w:r>
+      <w:r>
+        <w:t xml:space="preserve">at age 30-35, alongside interval colonoscopy.</w:t>
+      </w:r>
+      <w:r>
+        <w:rPr>
+          <w:vertAlign w:val="superscript"/>
+        </w:rPr>
+        <w:t xml:space="preserve">16</w:t>
+      </w:r>
+      <w:r>
+        <w:t xml:space="preserve"> </w:t>
+      </w:r>
+      <w:r>
+        <w:t xml:space="preserve">Office endometrial biopsy</w:t>
       </w:r>
       <w:r>
         <w:t xml:space="preserve"> </w:t>
@@ -2731,6 +2743,42 @@
       </w:r>
       <w:r>
         <w:t xml:space="preserve">Oncol 2017;144:324-328.</w:t>
+      </w:r>
+    </w:p>
+    <w:p>
+      <w:pPr>
+        <w:pStyle w:val="Compact"/>
+        <w:numPr>
+          <w:ilvl w:val="0"/>
+          <w:numId w:val="1001"/>
+        </w:numPr>
+      </w:pPr>
+      <w:r>
+        <w:t xml:space="preserve">National Comprehensive Cancer Network. NCCN Clinical Practice</w:t>
+      </w:r>
+      <w:r>
+        <w:t xml:space="preserve"> </w:t>
+      </w:r>
+      <w:r>
+        <w:t xml:space="preserve">Guidelines in Oncology: Genetic/Familial High-Risk Assessment:</w:t>
+      </w:r>
+      <w:r>
+        <w:t xml:space="preserve"> </w:t>
+      </w:r>
+      <w:r>
+        <w:t xml:space="preserve">Colorectal, Endometrial, Esophageal, and Gastric Cancer. Version</w:t>
+      </w:r>
+      <w:r>
+        <w:t xml:space="preserve"> </w:t>
+      </w:r>
+      <w:r>
+        <w:t xml:space="preserve">1.2026. Available at: https://www.nccn.org/guidelines. Accessed</w:t>
+      </w:r>
+      <w:r>
+        <w:t xml:space="preserve"> </w:t>
+      </w:r>
+      <w:r>
+        <w:t xml:space="preserve">September 2, 2026.</w:t>
       </w:r>
     </w:p>
     <w:bookmarkEnd w:id="14"/>

</xml_diff>

<commit_message>
Introduction: state explicitly what NCCN does and doesn't specify
Added "This guideline specifies timing and eligibility, not delivery
method." right after the NCCN citation -- NCCN governs when to screen
(interval, starting age) but takes no position on how to deliver the
biopsy (standalone office visit vs. combined with colonoscopy vs.
operative D&C as a fallback), which is the question this model answers.
Introduction now 241/250 words.
</commit_message>
<xml_diff>
--- a/manuscript/manuscript.docx
+++ b/manuscript/manuscript.docx
@@ -402,7 +402,13 @@
         <w:t xml:space="preserve"> </w:t>
       </w:r>
       <w:r>
-        <w:t xml:space="preserve">Office endometrial biopsy</w:t>
+        <w:t xml:space="preserve">This guideline specifies</w:t>
+      </w:r>
+      <w:r>
+        <w:t xml:space="preserve"> </w:t>
+      </w:r>
+      <w:r>
+        <w:t xml:space="preserve">timing and eligibility, not delivery method. Office endometrial biopsy</w:t>
       </w:r>
       <w:r>
         <w:t xml:space="preserve"> </w:t>

</xml_diff>